<commit_message>
feat(sales-kit): modèle économique école rémunérée (parent payeur), suppression du pilote gratuit
</commit_message>
<xml_diff>
--- a/public/sales-kit/01-fiche-produit-geschool.docx
+++ b/public/sales-kit/01-fiche-produit-geschool.docx
@@ -317,79 +317,79 @@
           <w:sz w:val="24"/>
           <w:szCs w:val="24"/>
         </w:rPr>
-        <w:t xml:space="preserve">Un coût minime par élève</w:t>
-      </w:r>
-    </w:p>
-    <w:p>
-      <w:pPr>
-        <w:pStyle w:val="ListParagraph"/>
-        <w:numPr>
-          <w:ilvl w:val="0"/>
-          <w:numId w:val="1"/>
-        </w:numPr>
-        <w:spacing w:after="80"/>
-      </w:pPr>
-      <w:r>
-        <w:rPr>
-          <w:color w:val="374151"/>
-          <w:sz w:val="21"/>
-          <w:szCs w:val="21"/>
-        </w:rPr>
-        <w:t xml:space="preserve">2 000 FCFA par élève à l'inscription (une seule fois).</w:t>
-      </w:r>
-    </w:p>
-    <w:p>
-      <w:pPr>
-        <w:pStyle w:val="ListParagraph"/>
-        <w:numPr>
-          <w:ilvl w:val="0"/>
-          <w:numId w:val="1"/>
-        </w:numPr>
-        <w:spacing w:after="80"/>
-      </w:pPr>
-      <w:r>
-        <w:rPr>
-          <w:color w:val="374151"/>
-          <w:sz w:val="21"/>
-          <w:szCs w:val="21"/>
-        </w:rPr>
-        <w:t xml:space="preserve">1 500 FCFA par élève et par mois.</w:t>
-      </w:r>
-    </w:p>
-    <w:p>
-      <w:pPr>
-        <w:pStyle w:val="ListParagraph"/>
-        <w:numPr>
-          <w:ilvl w:val="0"/>
-          <w:numId w:val="1"/>
-        </w:numPr>
-        <w:spacing w:after="80"/>
-      </w:pPr>
-      <w:r>
-        <w:rPr>
-          <w:color w:val="374151"/>
-          <w:sz w:val="21"/>
-          <w:szCs w:val="21"/>
-        </w:rPr>
-        <w:t xml:space="preserve">Option annuelle tout inclus : 20 000 FCFA par élève.</w:t>
-      </w:r>
-    </w:p>
-    <w:p>
-      <w:pPr>
-        <w:pStyle w:val="ListParagraph"/>
-        <w:numPr>
-          <w:ilvl w:val="0"/>
-          <w:numId w:val="1"/>
-        </w:numPr>
-        <w:spacing w:after="80"/>
-      </w:pPr>
-      <w:r>
-        <w:rPr>
-          <w:color w:val="374151"/>
-          <w:sz w:val="21"/>
-          <w:szCs w:val="21"/>
-        </w:rPr>
-        <w:t xml:space="preserve">Places d'établissements pilotes disponibles à tarif préférentiel.</w:t>
+        <w:t xml:space="preserve">Votre école gagne, elle ne dépense pas</w:t>
+      </w:r>
+    </w:p>
+    <w:p>
+      <w:pPr>
+        <w:pStyle w:val="ListParagraph"/>
+        <w:numPr>
+          <w:ilvl w:val="0"/>
+          <w:numId w:val="1"/>
+        </w:numPr>
+        <w:spacing w:after="80"/>
+      </w:pPr>
+      <w:r>
+        <w:rPr>
+          <w:color w:val="374151"/>
+          <w:sz w:val="21"/>
+          <w:szCs w:val="21"/>
+        </w:rPr>
+        <w:t xml:space="preserve">C'est le parent qui paie : 2 000 FCFA par élève à l'inscription, puis 1 500 FCFA par élève et par mois, via la plateforme.</w:t>
+      </w:r>
+    </w:p>
+    <w:p>
+      <w:pPr>
+        <w:pStyle w:val="ListParagraph"/>
+        <w:numPr>
+          <w:ilvl w:val="0"/>
+          <w:numId w:val="1"/>
+        </w:numPr>
+        <w:spacing w:after="80"/>
+      </w:pPr>
+      <w:r>
+        <w:rPr>
+          <w:color w:val="374151"/>
+          <w:sz w:val="21"/>
+          <w:szCs w:val="21"/>
+        </w:rPr>
+        <w:t xml:space="preserve">L'école reçoit 1 000 FCFA par élève à l'inscription, puis 750 FCFA par élève chaque mois : un vrai revenu supplémentaire.</w:t>
+      </w:r>
+    </w:p>
+    <w:p>
+      <w:pPr>
+        <w:pStyle w:val="ListParagraph"/>
+        <w:numPr>
+          <w:ilvl w:val="0"/>
+          <w:numId w:val="1"/>
+        </w:numPr>
+        <w:spacing w:after="80"/>
+      </w:pPr>
+      <w:r>
+        <w:rPr>
+          <w:color w:val="374151"/>
+          <w:sz w:val="21"/>
+          <w:szCs w:val="21"/>
+        </w:rPr>
+        <w:t xml:space="preserve">Vous gagnez deux fois : en productivité (tout est automatisé, plus rapide et efficace) et sur les paiements des parents.</w:t>
+      </w:r>
+    </w:p>
+    <w:p>
+      <w:pPr>
+        <w:pStyle w:val="ListParagraph"/>
+        <w:numPr>
+          <w:ilvl w:val="0"/>
+          <w:numId w:val="1"/>
+        </w:numPr>
+        <w:spacing w:after="80"/>
+      </w:pPr>
+      <w:r>
+        <w:rPr>
+          <w:color w:val="374151"/>
+          <w:sz w:val="21"/>
+          <w:szCs w:val="21"/>
+        </w:rPr>
+        <w:t xml:space="preserve">Votre école garde la majorité : 1 000 FCFA + 750 FCFA sur chaque 3 500 FCFA versé par un parent.</w:t>
       </w:r>
     </w:p>
     <w:p>

</xml_diff>